<commit_message>
docs: critique previous analysis; confirm +-1.5mm slot; update plan
- docs/vv-previous-analysis-critique.html (new): embeds the three previous-analysis
  figures (assembly_team_summary, feasible_envelope, rattle_analysis) and critiques
  them. They got the nominal geometry exactly right (envelope, rotation, 3.093mm
  ceiling) but wrongly asserted the peak-to-peak range is CONSTANT (a delta function)
  — it varies (P50 2.24, P95 3.01, locks to 0 for alternating) — and mixed several
  rattle metrics. Useful precursor, superseded.
- vv-research-findings.html + docx: toroidal slot +-1.5mm (3mm total) now stated as
  CONFIRMED against the gravity-support design (was a flagged assumption).
- vv-rattle-plan.html: updated to the peak-to-peak / n=1 metric (P95 3.01, ceiling
  3.093, nominal=worst), removed-script status, confirmed slot, current deliverables;
  remaining-work section marks cleanup/reports done and flags the open dynamic/fatigue
  and clearance items.
</commit_message>
<xml_diff>
--- a/docs/vv-rattle-report.docx
+++ b/docs/vv-rattle-report.docx
@@ -117,14 +117,14 @@
         <w:tc>
           <w:tcPr>
             <w:tcW w:type="dxa" w:w="8640"/>
-            <w:shd w:val="clear" w:fill="fff8e0"/>
+            <w:shd w:val="clear" w:fill="edf8ed"/>
             <w:tcBorders>
-              <w:left w:val="single" w:sz="24" w:color="cc8800"/>
+              <w:left w:val="single" w:sz="24" w:color="2a8a2a"/>
             </w:tcBorders>
             <w:tcBorders>
-              <w:top w:val="single" w:sz="4" w:color="fff8e0"/>
-              <w:bottom w:val="single" w:sz="4" w:color="fff8e0"/>
-              <w:right w:val="single" w:sz="4" w:color="fff8e0"/>
+              <w:top w:val="single" w:sz="4" w:color="edf8ed"/>
+              <w:bottom w:val="single" w:sz="4" w:color="edf8ed"/>
+              <w:right w:val="single" w:sz="4" w:color="edf8ed"/>
             </w:tcBorders>
           </w:tcPr>
           <w:p>
@@ -134,16 +134,16 @@
             <w:r>
               <w:rPr>
                 <w:b/>
-                <w:color w:val="CC8800"/>
+                <w:color w:val="2A8A2A"/>
               </w:rPr>
-              <w:t xml:space="preserve">Assumption (×2 sensitivity):  </w:t>
+              <w:t xml:space="preserve">Slot allowance — confirmed:  </w:t>
             </w:r>
             <w:r>
               <w:rPr>
                 <w:b w:val="0"/>
                 <w:sz w:val="20"/>
               </w:rPr>
-              <w:t xml:space="preserve">the toroidal slot allowance is taken as </w:t>
+              <w:t xml:space="preserve">the toroidal slot allowance is </w:t>
             </w:r>
             <w:r>
               <w:rPr>
@@ -157,7 +157,7 @@
                 <w:b w:val="0"/>
                 <w:sz w:val="20"/>
               </w:rPr>
-              <w:t>. If it is actually ±3 mm, every number below doubles. Confirm against the as-built gravity-support specification.</w:t>
+              <w:t>, confirmed against the gravity-support design (2026-05-27). The analysis is linear in the gap, so a ±3 mm slot would double every number; the confirmed ±1.5 mm fixes the scale.</w:t>
             </w:r>
           </w:p>
         </w:tc>
@@ -2182,7 +2182,7 @@
               <w:rPr>
                 <w:sz w:val="19"/>
               </w:rPr>
-              <w:t>Confirm the ±1.5 mm vs ±3 mm slot interpretation against the as-built GS spec (scales every number ×2).</w:t>
+              <w:t>Slot allowance ±1.5 mm (3 mm total) confirmed against the GS design (2026-05-27); numbers scale linearly with the slot.</w:t>
             </w:r>
           </w:p>
         </w:tc>

</xml_diff>